<commit_message>
Sync corrected demo and public skill stack
</commit_message>
<xml_diff>
--- a/demo/10a_scientific-report.docx
+++ b/demo/10a_scientific-report.docx
@@ -2,22 +2,30 @@
 <file path=word/document.xml><?xml version="1.0" encoding="utf-8"?>
 <w:document xmlns:w="http://schemas.openxmlformats.org/wordprocessingml/2006/main" xmlns:m="http://schemas.openxmlformats.org/officeDocument/2006/math" xmlns:r="http://schemas.openxmlformats.org/officeDocument/2006/relationships" xmlns:o="urn:schemas-microsoft-com:office:office" xmlns:v="urn:schemas-microsoft-com:vml" xmlns:w10="urn:schemas-microsoft-com:office:word" xmlns:a="http://schemas.openxmlformats.org/drawingml/2006/main" xmlns:pic="http://schemas.openxmlformats.org/drawingml/2006/picture" xmlns:wp="http://schemas.openxmlformats.org/drawingml/2006/wordprocessingDrawing">
   <w:body>
-    <w:bookmarkStart w:id="18" w:name="Xbb6a85def54118b163466e2cbb8c03ff6edb60f"/>
+    <w:bookmarkStart w:id="19" w:name="X658a6d7b51b03157f7a5b927d5ccdcd2c5a67e2"/>
     <w:p>
       <w:pPr>
         <w:pStyle w:val="Heading1"/>
       </w:pPr>
       <w:r>
-        <w:t xml:space="preserve">When a category is partly an artifact: poliovirus serotypes, then and now</w:t>
-      </w:r>
-    </w:p>
-    <w:bookmarkStart w:id="9" w:name="the-partition-we-trust"/>
+        <w:t xml:space="preserve">Poliovirus serotype fuzziness before standardization and after OPV2 withdrawal</w:t>
+      </w:r>
+    </w:p>
+    <w:p>
+      <w:pPr>
+        <w:pStyle w:val="FirstParagraph"/>
+      </w:pPr>
+      <w:r>
+        <w:t xml:space="preserve">The three-serotype framework is operationally sufficient for vaccination, but the boundaries were less clean in the pre-standardization literature than the modern reference system suggests. Cross-immunity experiments from 1949 include strains that sit between the canonical types. Subsequent assay and reference-strain standardization largely removed that ambiguity from routine observation.</w:t>
+      </w:r>
+    </w:p>
+    <w:bookmarkStart w:id="9" w:name="cross-immunity-in-the-1949-literature"/>
     <w:p>
       <w:pPr>
         <w:pStyle w:val="Heading2"/>
       </w:pPr>
       <w:r>
-        <w:t xml:space="preserve">The partition we trust</w:t>
+        <w:t xml:space="preserve">Cross-immunity in the 1949 literature</w:t>
       </w:r>
     </w:p>
     <w:p>
@@ -25,17 +33,25 @@
         <w:pStyle w:val="FirstParagraph"/>
       </w:pPr>
       <w:r>
-        <w:t xml:space="preserve">We sort polioviruses into three serotypes and treat that partition as a hard fact of the virus. Part of that hardness, though, is manufactured — an artifact of how the field standardized its assays in the early 1950s, not a property of the virus itself. The partition is mostly real, real enough to build vaccines on; but the people who built it, working before that standardization, were blunter about its edges than we are. They knew serotypes were fuzzy. We are only surprised now because the developments since the 1950s had largely defined the evidence away.</w:t>
+        <w:t xml:space="preserve">Amy Rosenfeld’s work on cross-reactive antibody responses in enteroviruses motivated a re-examination of the early poliovirus literature on how serotypes were defined. Those studies measured cross-immunity by immunizing monkeys against one strain and challenging them with another. Significant protection across the eventual type boundaries appears directly in the data.</w:t>
+      </w:r>
+    </w:p>
+    <w:p>
+      <w:pPr>
+        <w:pStyle w:val="BodyText"/>
+      </w:pPr>
+      <w:r>
+        <w:t xml:space="preserve">The virology leaders I know in the eradication program inherited the serotype dogma in the early 1980s or later, two to four generations after investigators such as Bodian worked out the original scheme and a generation after its assays and reagents had been standardized. By then, the ambiguity visible in the earlier experiments was no longer part of routine practice.</w:t>
       </w:r>
     </w:p>
     <w:bookmarkEnd w:id="9"/>
-    <w:bookmarkStart w:id="10" w:name="what-the-1949-literature-already-knew"/>
+    <w:bookmarkStart w:id="14" w:name="the-normal-pattern-per-and-kotter"/>
     <w:p>
       <w:pPr>
         <w:pStyle w:val="Heading2"/>
       </w:pPr>
       <w:r>
-        <w:t xml:space="preserve">What the 1949 literature already knew</w:t>
+        <w:t xml:space="preserve">The normal pattern, Per, and Kotter</w:t>
       </w:r>
     </w:p>
     <w:p>
@@ -43,25 +59,7 @@
         <w:pStyle w:val="FirstParagraph"/>
       </w:pPr>
       <w:r>
-        <w:t xml:space="preserve">This is not a new worry dressed up as history. In the pre-standardization literature you can watch people work out what serotypes were by measuring cross-immunity across many monkeys, and the existence of significant cross-immunity runs squarely counter to the dogma as most of us were taught it. That is partly a matter of who taught it to whom. The virologists the eradication program inherited its framework from picked up the serotype dogma in the early 1980s or later — two to four generations after the people, like Bodian, who first worked out what polio is, and a full generation after the assays and reagents were standardized. By the time the framework reached us, it had already been cleaned up. The tables from before the cleanup tell the rest.</w:t>
-      </w:r>
-    </w:p>
-    <w:bookmarkEnd w:id="10"/>
-    <w:bookmarkStart w:id="13" w:name="the-scheme-and-its-exceptions"/>
-    <w:p>
-      <w:pPr>
-        <w:pStyle w:val="Heading2"/>
-      </w:pPr>
-      <w:r>
-        <w:t xml:space="preserve">The scheme and its exceptions</w:t>
-      </w:r>
-    </w:p>
-    <w:p>
-      <w:pPr>
-        <w:pStyle w:val="FirstParagraph"/>
-      </w:pPr>
-      <w:r>
-        <w:t xml:space="preserve">The three-serotype scheme was established by Bodian, Morgan, and Howe in 1949, in a three-part series in the</w:t>
+        <w:t xml:space="preserve">Bodian, Morgan, and Howe established the three-serotype grouping in a 1949 series in the</w:t>
       </w:r>
       <w:r>
         <w:t xml:space="preserve"> </w:t>
@@ -77,7 +75,7 @@
         <w:t xml:space="preserve"> </w:t>
       </w:r>
       <w:r>
-        <w:t xml:space="preserve">(vol. 49; the journal was later renamed the</w:t>
+        <w:t xml:space="preserve">(later renamed the</w:t>
       </w:r>
       <w:r>
         <w:t xml:space="preserve"> </w:t>
@@ -90,19 +88,19 @@
         <w:t xml:space="preserve">American Journal of Epidemiology</w:t>
       </w:r>
       <w:r>
-        <w:t xml:space="preserve">) — the third part reports the grouping of fourteen strains into three basic immunological types.</w:t>
+        <w:t xml:space="preserve">).</w:t>
       </w:r>
       <w:r>
         <w:rPr>
           <w:rStyle w:val="FootnoteReference"/>
         </w:rPr>
-        <w:footnoteReference w:id="11"/>
+        <w:footnoteReference w:id="10"/>
       </w:r>
       <w:r>
         <w:t xml:space="preserve"> </w:t>
       </w:r>
       <w:r>
-        <w:t xml:space="preserve">Strains then still carried the names of where they came from: MEF-1, for one, was named for the Middle East Forces of the British Army, after a 1942 outbreak among servicemen. The archetypes were Brunhilde (type 1), Lansing (type 2), and Leon (type 3), and the type-defining pattern is clean when it holds — monkeys immunized with Lansing (type 2) resist challenge by other type 2 viruses but are paralyzed at roughly control rates by type 1 (Brunhilde-like) viruses, and vice versa.</w:t>
+        <w:t xml:space="preserve">The fourteen strains were compared with the three archetypes: Brunhilde (type 1), Lansing (type 2), and Leon (type 3). The normal type-defining pattern is clear. Monkeys immunized with Lansing resist challenge by other Lansing-like viruses but are paralyzed at approximately the control rate when challenged with Brunhilde-like viruses, and vice versa.</w:t>
       </w:r>
     </w:p>
     <w:p>
@@ -110,31 +108,15 @@
         <w:pStyle w:val="BodyText"/>
       </w:pPr>
       <w:r>
-        <w:t xml:space="preserve">The exceptions are the point. The</w:t>
-      </w:r>
-      <w:r>
-        <w:t xml:space="preserve"> </w:t>
-      </w:r>
-      <w:r>
-        <w:t xml:space="preserve">“Per”</w:t>
-      </w:r>
-      <w:r>
-        <w:t xml:space="preserve"> </w:t>
-      </w:r>
-      <w:r>
-        <w:t xml:space="preserve">strain — reportedly isolated from a three-year-old girl who died in West Virginia in 1940, and autopsied by Albert Sabin — is fully protected by type 1 vaccination yet also shows significant cross-protection from type 2. It is grouped as a type 1, but it sits in the middle.</w:t>
-      </w:r>
-      <w:r>
-        <w:t xml:space="preserve"> </w:t>
-      </w:r>
-      <w:r>
-        <w:t xml:space="preserve">“Kover”</w:t>
-      </w:r>
-      <w:r>
-        <w:t xml:space="preserve"> </w:t>
-      </w:r>
-      <w:r>
-        <w:t xml:space="preserve">does the same thing symmetrically: from a single table you might dismiss the partial cross-protection as noise, but it recurs in Morgan’s reciprocal-immunity companion paper,</w:t>
+        <w:t xml:space="preserve">But there are exceptions. Per reportedly came from a three-year-old girl who died in West Virginia in 1940 and was autopsied by Albert Sabin. Monkeys immunized against type 1 were fully protected when challenged with Per, but type 2 immunization also provided significant cross-protection. Per was grouped as type 1, but it sits in the middle.</w:t>
+      </w:r>
+    </w:p>
+    <w:p>
+      <w:pPr>
+        <w:pStyle w:val="BodyText"/>
+      </w:pPr>
+      <w:r>
+        <w:t xml:space="preserve">Kotter shows the reciprocal pattern. In the Bodian table, Lansing immunization appears partly protective against Kotter. In Morgan’s companion experiment, immunization with Kotter appears partly protective against Lansing.</w:t>
       </w:r>
       <w:r>
         <w:rPr>
@@ -146,17 +128,17 @@
         <w:t xml:space="preserve"> </w:t>
       </w:r>
       <w:r>
-        <w:t xml:space="preserve">where vaccinating with Kover (type 1) is somewhat cross-protective against Lansing (type 2) just as Lansing is somewhat protective against Kover. And the small numbers deserve to be taken seriously rather than waved off. I can’t rule out sampling variation or lab error, but across many years of reading tables like these, the same strain is usually reproducible to within one monkey across papers — so a 2-of-6 where you expect 6-of-6 is weird.</w:t>
-      </w:r>
-    </w:p>
-    <w:bookmarkEnd w:id="13"/>
-    <w:bookmarkStart w:id="14" w:name="how-the-fuzziness-was-defined-away"/>
+        <w:t xml:space="preserve">I cannot rule out sampling variation or laboratory error. Still, across many years of looking at tables like these, assays using the same strain are usually reproducible to within one monkey across papers. Two of six animals affected when the expectation is six of six is weird.</w:t>
+      </w:r>
+    </w:p>
+    <w:bookmarkEnd w:id="14"/>
+    <w:bookmarkStart w:id="15" w:name="what-standardization-removed-from-view"/>
     <w:p>
       <w:pPr>
         <w:pStyle w:val="Heading2"/>
       </w:pPr>
       <w:r>
-        <w:t xml:space="preserve">How the fuzziness was defined away</w:t>
+        <w:t xml:space="preserve">What standardization removed from view</w:t>
       </w:r>
     </w:p>
     <w:p>
@@ -164,17 +146,25 @@
         <w:pStyle w:val="FirstParagraph"/>
       </w:pPr>
       <w:r>
-        <w:t xml:space="preserve">This is old, small-N data, and I will not pretend otherwise. But it comes from an era when genetic diversity was high, population immunity across serotypes was not yet synchronized by trivalent vaccines, and, crucially, before the assays and algorithms were built to remove exactly this ambiguity. In the early 1950s, cell culture and the three-serotype scheme were standardized together for vaccine development. Labs stopped working with the old monkey-isolated strains and referenced everything to a few prototypes — Mahoney or Brunhilde (type 1), Lansing (type 2), Leon (type 3). The other named isolates mostly disappear from the literature in that period; of the fourteen strains in that grouping, only four survived to be sequenced decades later, in the 1980s and 90s — Brunhilde, Lansing, MEF-1, and Leon. If your aim is to vaccinate against three types, none of the lost nuance matters. But in the canonizing of those stylized facts, we lost the common knowledge that the story is fuzzy.</w:t>
-      </w:r>
-    </w:p>
-    <w:bookmarkEnd w:id="14"/>
-    <w:bookmarkStart w:id="15" w:name="an-evolutionary-reading"/>
+        <w:t xml:space="preserve">These are old, small-N data. They also come from a period of high genetic diversity, before trivalent vaccination synchronized population immunity across serotypes and before assays and algorithms were defined to remove ambiguity among them. In the early 1950s, cell culture and the three-serotype scheme were standardized together for vaccine development. Laboratories stopped working with most of the old monkey-isolated strains and referenced tests to Mahoney or Brunhilde (type 1), Lansing (type 2), and Leon (type 3). Most of the other named isolates disappeared from the literature. By my count, of the fourteen strains in Bodian’s grouping, only four survived to be sequenced in the 1980s and 1990s: Brunhilde, Lansing, MEF-1, and Leon.</w:t>
+      </w:r>
+    </w:p>
+    <w:p>
+      <w:pPr>
+        <w:pStyle w:val="BodyText"/>
+      </w:pPr>
+      <w:r>
+        <w:t xml:space="preserve">For vaccination against three types, this lost nuance did not matter operationally. But in canonizing those stylized facts, the field lost the common knowledge that the story was fuzzy.</w:t>
+      </w:r>
+    </w:p>
+    <w:bookmarkEnd w:id="15"/>
+    <w:bookmarkStart w:id="16" w:name="a-conjecture-about-population-immunity"/>
     <w:p>
       <w:pPr>
         <w:pStyle w:val="Heading2"/>
       </w:pPr>
       <w:r>
-        <w:t xml:space="preserve">An evolutionary reading</w:t>
+        <w:t xml:space="preserve">A conjecture about population immunity</w:t>
       </w:r>
     </w:p>
     <w:p>
@@ -182,17 +172,25 @@
         <w:pStyle w:val="FirstParagraph"/>
       </w:pPr>
       <w:r>
-        <w:t xml:space="preserve">It is worth speculating about the evolutionary dynamics — as speculation. Assume that between-type viruses are less intrinsically fit, but that they persist at least transiently when population immunity across serotypes is heterogeneous. What would history look like? Before vaccination, outbreaks came in seasonal waves of a single serotype — at least in wealthier communities, where the age of infection was older and paralysis therefore more visible; poorer communities like Houston in the mid-1950s saw every serotype every year. Any given town thus carried heterogeneous immunity in its children. If last year’s outbreak was a type 1 in a place that had seen no type 2 for a few years, this year’s type 1 would do a little better by looking a little more type-2-like. Per could be exactly such a virus — one that immunizes against type 1 and a bit against type 2. The permutations are open in principle, but the key thing is simple: as long as there are towns where a serotype skips years, the population can select for off-type drift among the variants that survive the low periods. Then trivalent vaccine arrives. Most children are immunized against all three types at once, early in life, and that population-level heterogeneity collapses.</w:t>
-      </w:r>
-    </w:p>
-    <w:bookmarkEnd w:id="15"/>
-    <w:bookmarkStart w:id="16" w:name="why-it-is-live-again"/>
+        <w:t xml:space="preserve">The following evolutionary argument is conjectural. Assume that viruses between types tend to be less intrinsically fit, but are more likely to persist transiently when population immunity is heterogeneous across serotypes. Before vaccination, outbreaks often came in seasonal waves of a single serotype, at least in wealthier communities where paralysis was more common because the age of infection was older. A town that had experienced type 1 but not type 2 for several years would have children with heterogeneous immunity across the two types. Under that condition, a type 1 virus might do better if it were a little more type-2-like. Per could be a virus like that.</w:t>
+      </w:r>
+    </w:p>
+    <w:p>
+      <w:pPr>
+        <w:pStyle w:val="BodyText"/>
+      </w:pPr>
+      <w:r>
+        <w:t xml:space="preserve">All the permutations are possible in principle. The condition that matters is the existence of places where a serotype skips years: population immunity can then select for viruses drifting off-type among those that persist through the endemic low periods. Trivalent vaccination changed that condition. Most people were immunized with all three strains at the same time early in life, and population-level heterogeneity across serotypes became much lower.</w:t>
+      </w:r>
+    </w:p>
+    <w:bookmarkEnd w:id="16"/>
+    <w:bookmarkStart w:id="17" w:name="why-the-question-is-live-again"/>
     <w:p>
       <w:pPr>
         <w:pStyle w:val="Heading2"/>
       </w:pPr>
       <w:r>
-        <w:t xml:space="preserve">Why it is live again</w:t>
+        <w:t xml:space="preserve">Why the question is live again</w:t>
       </w:r>
     </w:p>
     <w:p>
@@ -200,7 +198,15 @@
         <w:pStyle w:val="FirstParagraph"/>
       </w:pPr>
       <w:r>
-        <w:t xml:space="preserve">In the modern era we find wild polioviruses under strong purifying selection: they do not drift far antigenically for long, though titers around the reference strains routinely vary by factors of four to eight when we look. Between sequencing everything, typing on VP1 alone, and the prior that between-serotype viruses are unfit, the people who run the typing assays have never seen one in their lives. Then we withdrew the type 2 vaccine. Population immunity across serotypes is now becoming more heterogeneous than it has ever been, even as the standing genetic diversity of wild poliovirus stays very small. Put those together and the expectation follows: wait a few years, and we should start to notice viruses that sit between serotypes. Given the historical data, our own experience of bOPV cross-protection against type 2, and modern work on cross-reactivity across the enterovirus family, the idea that a poliovirus could be</w:t>
+        <w:t xml:space="preserve">Modern wild polioviruses are under strong purifying selection and do not drift far antigenically for long, although titers around the reference strains routinely vary by factors of four to eight. Between only sequencing, basing intratypic differentiation on VP1, and assuming that between-serotype viruses are less fit, the people running the typing assays have never seen one in their lives.</w:t>
+      </w:r>
+    </w:p>
+    <w:p>
+      <w:pPr>
+        <w:pStyle w:val="BodyText"/>
+      </w:pPr>
+      <w:r>
+        <w:t xml:space="preserve">Withdrawal of the type 2 vaccine is now making population immunity across serotypes much more heterogeneous, while the standing genetic diversity of wild poliovirus remains very small. Looking at the historical data, cross-protection from bOPV against type 2, my colleague’s review of similar early data, and her modern work on enterovirus cross-reactivity, I conclude that after a few years we should start to notice viruses that sit between serotypes. The idea that a poliovirus can be</w:t>
       </w:r>
       <w:r>
         <w:t xml:space="preserve"> </w:t>
@@ -212,17 +218,17 @@
         <w:t xml:space="preserve"> </w:t>
       </w:r>
       <w:r>
-        <w:t xml:space="preserve">should not be surprising at all. The partition was always fuzzier than the reference panel made it look — and we are now removing one of the forces that kept it looking sharp.</w:t>
-      </w:r>
-    </w:p>
-    <w:bookmarkEnd w:id="16"/>
-    <w:bookmarkStart w:id="17" w:name="provenance-disclosure"/>
+        <w:t xml:space="preserve">should not be surprising at all.</w:t>
+      </w:r>
+    </w:p>
+    <w:bookmarkEnd w:id="17"/>
+    <w:bookmarkStart w:id="18" w:name="provenance-and-disclosure"/>
     <w:p>
       <w:pPr>
         <w:pStyle w:val="Heading2"/>
       </w:pPr>
       <w:r>
-        <w:t xml:space="preserve">Provenance &amp; disclosure</w:t>
+        <w:t xml:space="preserve">Provenance and disclosure</w:t>
       </w:r>
     </w:p>
     <w:p>
@@ -230,7 +236,7 @@
         <w:pStyle w:val="FirstParagraph"/>
       </w:pPr>
       <w:r>
-        <w:t xml:space="preserve">Produced with AI assistance under a my-voice-my-words writing workflow. It transports a single, lightly-redacted source — the author’s own email (</w:t>
+        <w:t xml:space="preserve">Prepared with AI assistance from a single, lightly redacted source email (</w:t>
       </w:r>
       <w:r>
         <w:rPr>
@@ -239,7 +245,7 @@
         <w:t xml:space="preserve">raw_source_serotype-fuzziness.md</w:t>
       </w:r>
       <w:r>
-        <w:t xml:space="preserve">): the assistant arranged the author’s verbatim spans to an outline and drafted the connective tissue, then the draft was independently audited for generic language, voice fidelity, and claim defensibility, and its citations were re-researched and fetch-verified. Every human-in-the-loop decision is in</w:t>
+        <w:t xml:space="preserve">) through the shared verbatim substrate in</w:t>
       </w:r>
       <w:r>
         <w:t xml:space="preserve"> </w:t>
@@ -248,10 +254,22 @@
         <w:rPr>
           <w:rStyle w:val="VerbatimChar"/>
         </w:rPr>
-        <w:t xml:space="preserve">decision-log.md</w:t>
-      </w:r>
-      <w:r>
-        <w:t xml:space="preserve">; per-claim status is in</w:t>
+        <w:t xml:space="preserve">04_frankendraft.md</w:t>
+      </w:r>
+      <w:r>
+        <w:t xml:space="preserve">. The assistant transported the author’s spans into a formal register and generated bounded connective framing. Citation verification is recorded in</w:t>
+      </w:r>
+      <w:r>
+        <w:t xml:space="preserve"> </w:t>
+      </w:r>
+      <w:r>
+        <w:rPr>
+          <w:rStyle w:val="VerbatimChar"/>
+        </w:rPr>
+        <w:t xml:space="preserve">07_bibliography.md</w:t>
+      </w:r>
+      <w:r>
+        <w:t xml:space="preserve">; per-claim evidence status is recorded separately in</w:t>
       </w:r>
       <w:r>
         <w:t xml:space="preserve"> </w:t>
@@ -263,59 +281,7 @@
         <w:t xml:space="preserve">06_claim-ledger.md</w:t>
       </w:r>
       <w:r>
-        <w:t xml:space="preserve">.</w:t>
-      </w:r>
-      <w:r>
-        <w:t xml:space="preserve"> </w:t>
-      </w:r>
-      <w:r>
-        <w:rPr>
-          <w:b/>
-          <w:bCs/>
-        </w:rPr>
-        <w:t xml:space="preserve">Unresolved:</w:t>
-      </w:r>
-      <w:r>
-        <w:t xml:space="preserve"> </w:t>
-      </w:r>
-      <w:r>
-        <w:t xml:space="preserve">the</w:t>
-      </w:r>
-      <w:r>
-        <w:t xml:space="preserve"> </w:t>
-      </w:r>
-      <w:r>
-        <w:t xml:space="preserve">“Per”</w:t>
-      </w:r>
-      <w:r>
-        <w:t xml:space="preserve"> </w:t>
-      </w:r>
-      <w:r>
-        <w:t xml:space="preserve">and</w:t>
-      </w:r>
-      <w:r>
-        <w:t xml:space="preserve"> </w:t>
-      </w:r>
-      <w:r>
-        <w:t xml:space="preserve">“Kover”</w:t>
-      </w:r>
-      <w:r>
-        <w:t xml:space="preserve"> </w:t>
-      </w:r>
-      <w:r>
-        <w:t xml:space="preserve">strains and the</w:t>
-      </w:r>
-      <w:r>
-        <w:t xml:space="preserve"> </w:t>
-      </w:r>
-      <w:r>
-        <w:t xml:space="preserve">“four of fourteen”</w:t>
-      </w:r>
-      <w:r>
-        <w:t xml:space="preserve"> </w:t>
-      </w:r>
-      <w:r>
-        <w:t xml:space="preserve">count are the author’s reading of the primary 1949 tables and are not independently attested in the indexed secondary literature. Final wording, claim strength, and emphasis remain the author’s.</w:t>
+        <w:t xml:space="preserve">. The Per and Kotter interpretations remain the author’s reading of the primary tables, while the four-of-fourteen sequencing count is an author-sourced domain claim with limited external verification. The original autonomous demo allowed the assistant to simulate human decisions; that simulation is part of the workflow record, not evidence of author approval.</w:t>
       </w:r>
     </w:p>
     <w:p>
@@ -325,8 +291,8 @@
         </w:pict>
       </w:r>
     </w:p>
-    <w:bookmarkEnd w:id="17"/>
     <w:bookmarkEnd w:id="18"/>
+    <w:bookmarkEnd w:id="19"/>
     <w:sectPr>
       <w:pgSz w:h="15840" w:w="12240"/>
       <w:pgMar w:bottom="1440" w:footer="720" w:gutter="0" w:header="720" w:left="1440" w:right="1440" w:top="1440"/>
@@ -357,7 +323,7 @@
       </w:r>
     </w:p>
   </w:footnote>
-  <w:footnote w:id="11">
+  <w:footnote w:id="10">
     <w:p>
       <w:pPr>
         <w:pStyle w:val="FootnoteText"/>
@@ -388,7 +354,21 @@
         <w:t xml:space="preserve"> </w:t>
       </w:r>
       <w:r>
-        <w:t xml:space="preserve">1949;49(2):234–245. (The three-type scheme was foreshadowed by Burnet &amp; Macnamara’s 1931 demonstration of poliovirus antigenic types and confirmed by the NFIP typing committee c. 1951; the 1949 series is where the three-type grouping was formalized.)</w:t>
+        <w:t xml:space="preserve">1949;49(2):234-245.</w:t>
+      </w:r>
+      <w:r>
+        <w:t xml:space="preserve"> </w:t>
+      </w:r>
+      <w:hyperlink r:id="rId11">
+        <w:r>
+          <w:rPr>
+            <w:rStyle w:val="Hyperlink"/>
+          </w:rPr>
+          <w:t xml:space="preserve">PubMed 18113220</w:t>
+        </w:r>
+      </w:hyperlink>
+      <w:r>
+        <w:t xml:space="preserve">. The three-type scheme was foreshadowed by Burnet and Macnamara’s 1931 demonstration of poliovirus antigenic types and confirmed by the NFIP typing committee around 1951; the 1949 series formalized the grouping used here. The Per grouping is the author’s reading of the primary table.</w:t>
       </w:r>
     </w:p>
   </w:footnote>
@@ -407,7 +387,7 @@
         <w:t xml:space="preserve"> </w:t>
       </w:r>
       <w:r>
-        <w:t xml:space="preserve">Morgan IM. Differentiation of types of poliomyelitis viruses. II. …by reciprocal vaccination-immunity experiments.</w:t>
+        <w:t xml:space="preserve">Morgan IM. Differentiation of types of poliomyelitis viruses. II. By reciprocal vaccination-immunity experiments.</w:t>
       </w:r>
       <w:r>
         <w:t xml:space="preserve"> </w:t>
@@ -423,31 +403,21 @@
         <w:t xml:space="preserve"> </w:t>
       </w:r>
       <w:r>
-        <w:t xml:space="preserve">1949;49(2):225–233. The</w:t>
+        <w:t xml:space="preserve">1949;49(2):225-233.</w:t>
       </w:r>
       <w:r>
         <w:t xml:space="preserve"> </w:t>
       </w:r>
-      <w:r>
-        <w:t xml:space="preserve">“Per”</w:t>
-      </w:r>
-      <w:r>
-        <w:t xml:space="preserve"> </w:t>
-      </w:r>
-      <w:r>
-        <w:t xml:space="preserve">and</w:t>
-      </w:r>
-      <w:r>
-        <w:t xml:space="preserve"> </w:t>
-      </w:r>
-      <w:r>
-        <w:t xml:space="preserve">“Kover”</w:t>
-      </w:r>
-      <w:r>
-        <w:t xml:space="preserve"> </w:t>
-      </w:r>
-      <w:r>
-        <w:t xml:space="preserve">strain details appear in the primary 1949 tables and are cited to that source; they are not independently attested in the indexed secondary literature.</w:t>
+      <w:hyperlink r:id="rId13">
+        <w:r>
+          <w:rPr>
+            <w:rStyle w:val="Hyperlink"/>
+          </w:rPr>
+          <w:t xml:space="preserve">PubMed 18124443</w:t>
+        </w:r>
+      </w:hyperlink>
+      <w:r>
+        <w:t xml:space="preserve">. The Kotter grouping and cross-protection details are the author’s reading of the primary 1949 table; they are not independently attested in the indexed secondary literature.</w:t>
       </w:r>
     </w:p>
   </w:footnote>

</xml_diff>